<commit_message>
Update HP-only agreement: phone allowance, disclosure exception, shorter survival period
Adds a $100/month cell phone allowance (replacing the no-phone-reimbursement
clause), allows disclosure of confidential information when Bill Gusmano
authorizes it in writing, and shortens the confidentiality survival period
for non-trade-secret information from 3 years to 12 months.

Co-Authored-By: Claude Sonnet 5 <noreply@anthropic.com>
Claude-Session: https://claude.ai/code/session_019EoJuzBaRKmij9AN1LjC6F
</commit_message>
<xml_diff>
--- a/docs/mmg/sales-compensation/MMG - Sales Commission Agreement - Jeff Gibbs - HP Consumer Only - Sep-Dec 2026.docx
+++ b/docs/mmg/sales-compensation/MMG - Sales Commission Agreement - Jeff Gibbs - HP Consumer Only - Sep-Dec 2026.docx
@@ -310,7 +310,7 @@
           <w:sz w:val="20"/>
           <w:szCs w:val="20"/>
         </w:rPr>
-        <w:t xml:space="preserve">This Agreement covers only HP Consumer business through Alex Botham (and related referral video work) — no other account, September 1 through December 31, 2026. Commission is 15% of revenue, but every deal still needs Bill’s written approval of the rate and margin before it goes to the customer; Bill may approve a lower rate on a deal if needed to protect margin. MMG will not pay Jeff’s personal cell phone or internet bill or provide a standing expense account, but MMG may issue a company phone if he wants one for this work — all travel, entertainment, and client-facing expenses need pre-approval. MMG’s IP and confidential information stay protected. There is no non-compete or non-solicitation restriction in this Agreement.</w:t>
+        <w:t xml:space="preserve">This Agreement covers only HP Consumer business through Alex Botham (and related referral video work) — no other account, September 1 through December 31, 2026. Commission is 15% of revenue, but every deal still needs Bill’s written approval of the rate and margin before it goes to the customer; Bill may approve a lower rate on a deal if needed to protect margin. MMG will pay a $100/month cell phone allowance but not an internet bill or a standing expense account — all other travel, entertainment, and client-facing expenses need pre-approval. MMG’s IP and confidential information stay protected, with disclosure allowed only if Bill authorizes it in writing. There is no non-compete or non-solicitation restriction in this Agreement.</w:t>
       </w:r>
     </w:p>
     <w:p>
@@ -950,7 +950,27 @@
           <w:sz w:val="21"/>
           <w:szCs w:val="21"/>
         </w:rPr>
-        <w:t xml:space="preserve">MMG does not pay for, or reimburse, the Sales Representative’s personal cell phone bill or personal internet bill, and does not provide a standing monthly expense account under this Agreement. If the Sales Representative wants a phone for this work, MMG may, at its option, issue a company phone and phone number instead.</w:t>
+        <w:t xml:space="preserve">MMG will pay a cell phone allowance of </w:t>
+      </w:r>
+      <w:r>
+        <w:rPr>
+          <w:rFonts w:ascii="Open Sans" w:cs="Open Sans" w:eastAsia="Open Sans" w:hAnsi="Open Sans"/>
+          <w:b/>
+          <w:bCs/>
+          <w:color w:val="1D1D1B"/>
+          <w:sz w:val="21"/>
+          <w:szCs w:val="21"/>
+        </w:rPr>
+        <w:t xml:space="preserve">$100 per month</w:t>
+      </w:r>
+      <w:r>
+        <w:rPr>
+          <w:rFonts w:ascii="Open Sans" w:cs="Open Sans" w:eastAsia="Open Sans" w:hAnsi="Open Sans"/>
+          <w:color w:val="1D1D1B"/>
+          <w:sz w:val="21"/>
+          <w:szCs w:val="21"/>
+        </w:rPr>
+        <w:t xml:space="preserve"> toward the Sales Representative’s personal cell phone bill. MMG does not pay or reimburse the Sales Representative’s personal internet bill, and does not provide any other standing monthly expense account under this Agreement.</w:t>
       </w:r>
     </w:p>
     <w:p>
@@ -969,7 +989,7 @@
           <w:sz w:val="21"/>
           <w:szCs w:val="21"/>
         </w:rPr>
-        <w:t xml:space="preserve">All expenses — including travel, client entertainment, and dinners — require MMG’s written pre-approval before they are incurred. MMG will not reimburse any expense that was not pre-approved.</w:t>
+        <w:t xml:space="preserve">All other expenses — including travel, client entertainment, and dinners — require MMG’s written pre-approval before they are incurred. MMG will not reimburse any expense that was not pre-approved.</w:t>
       </w:r>
     </w:p>
     <w:p>
@@ -1003,7 +1023,27 @@
           <w:sz w:val="21"/>
           <w:szCs w:val="21"/>
         </w:rPr>
-        <w:t xml:space="preserve">MMG IP and Customer IP remain MMG’s or the customer’s property; nothing here transfers any ownership to the Sales Representative, and any improvement the Sales Representative contributes to MMG IP is owned by MMG. The Sales Representative shall keep all MMG IP, Customer IP, and other non-public MMG information (pricing, cost structures, margin data, commission terms, financial information, customer lists, deal terms) confidential, use it solely to perform this Agreement, never disclose it to any third party — including any customer, prospect, other employer, or business — and return or destroy all of it on termination or MMG’s request. This obligation survives termination indefinitely for trade secrets and for three (3) years for other confidential information.</w:t>
+        <w:t xml:space="preserve">MMG IP and Customer IP remain MMG’s or the customer’s property; nothing here transfers any ownership to the Sales Representative, and any improvement the Sales Representative contributes to MMG IP is owned by MMG. The Sales Representative shall keep all MMG IP, Customer IP, and other non-public MMG information (pricing, cost structures, margin data, commission terms, financial information, customer lists, deal terms) confidential, use it solely to perform this Agreement, and never disclose it to any third party — including any customer, prospect, other employer, or business — </w:t>
+      </w:r>
+      <w:r>
+        <w:rPr>
+          <w:rFonts w:ascii="Open Sans" w:cs="Open Sans" w:eastAsia="Open Sans" w:hAnsi="Open Sans"/>
+          <w:b/>
+          <w:bCs/>
+          <w:color w:val="1D1D1B"/>
+          <w:sz w:val="21"/>
+          <w:szCs w:val="21"/>
+        </w:rPr>
+        <w:t xml:space="preserve">unless authorized in writing by Bill Gusmano</w:t>
+      </w:r>
+      <w:r>
+        <w:rPr>
+          <w:rFonts w:ascii="Open Sans" w:cs="Open Sans" w:eastAsia="Open Sans" w:hAnsi="Open Sans"/>
+          <w:color w:val="1D1D1B"/>
+          <w:sz w:val="21"/>
+          <w:szCs w:val="21"/>
+        </w:rPr>
+        <w:t xml:space="preserve">, and shall return or destroy all of it on termination or MMG’s request. This obligation survives termination indefinitely for trade secrets and for twelve (12) months for other confidential information.</w:t>
       </w:r>
     </w:p>
     <w:p>

</xml_diff>

<commit_message>
Bump Jeff Gibbs cell phone allowance to \$120/month
Co-Authored-By: Claude Sonnet 5 <noreply@anthropic.com>
Claude-Session: https://claude.ai/code/session_019EoJuzBaRKmij9AN1LjC6F
</commit_message>
<xml_diff>
--- a/docs/mmg/sales-compensation/MMG - Sales Commission Agreement - Jeff Gibbs - HP Consumer Only - Sep-Dec 2026.docx
+++ b/docs/mmg/sales-compensation/MMG - Sales Commission Agreement - Jeff Gibbs - HP Consumer Only - Sep-Dec 2026.docx
@@ -310,7 +310,7 @@
           <w:sz w:val="20"/>
           <w:szCs w:val="20"/>
         </w:rPr>
-        <w:t xml:space="preserve">This Agreement covers only HP Consumer business through Alex Botham (and related referral video work) — no other account, September 1 through December 31, 2026. Commission is 15% of revenue, but every deal still needs Bill’s written approval of the rate and margin before it goes to the customer; Bill may approve a lower rate on a deal if needed to protect margin. MMG will pay a $100/month cell phone allowance but not an internet bill or a standing expense account — all other travel, entertainment, and client-facing expenses need pre-approval. MMG’s IP and confidential information stay protected, with disclosure allowed only if Bill authorizes it in writing. There is no non-compete or non-solicitation restriction in this Agreement.</w:t>
+        <w:t xml:space="preserve">This Agreement covers only HP Consumer business through Alex Botham (and related referral video work) — no other account, September 1 through December 31, 2026. Commission is 15% of revenue, but every deal still needs Bill’s written approval of the rate and margin before it goes to the customer; Bill may approve a lower rate on a deal if needed to protect margin. MMG will pay a $120/month cell phone allowance but not an internet bill or a standing expense account — all other travel, entertainment, and client-facing expenses need pre-approval. MMG’s IP and confidential information stay protected, with disclosure allowed only if Bill authorizes it in writing. There is no non-compete or non-solicitation restriction in this Agreement.</w:t>
       </w:r>
     </w:p>
     <w:p>
@@ -961,7 +961,7 @@
           <w:sz w:val="21"/>
           <w:szCs w:val="21"/>
         </w:rPr>
-        <w:t xml:space="preserve">$100 per month</w:t>
+        <w:t xml:space="preserve">$120 per month</w:t>
       </w:r>
       <w:r>
         <w:rPr>

</xml_diff>